<commit_message>
docs: finalize design doc + demo script - premium polish pass
- Remove AI-tell typography (em/en dashes, arrows, mult/middot, check/play
  marks); kept µs as correct microsecond notation
- Rewrite the HLD system diagram as a clean vertical T1->T2->T3 flow that
  fits any page width (the old 3-column ASCII garbled when wrapped)
- Drop the date from the title block
- Unify spelling (centerpiece), tighten a few sentences where an arrow had
  become an awkward "to"
- Regenerate .docx via a custom premium reference template: shaded + bold
  table header rows, light bordered grid, teal-blue headings, TOC
- Fix demo-script timestamp headings ([0:00 - 0:30] format)

Co-Authored-By: Claude Opus 4.8 <noreply@anthropic.com>
</commit_message>
<xml_diff>
--- a/deliverables/IICPC_Demo_Video_Script.docx
+++ b/deliverables/IICPC_Demo_Video_Script.docx
@@ -15,7 +15,7 @@
         <w:pStyle w:val="Subtitle"/>
       </w:pPr>
       <w:r>
-        <w:t xml:space="preserve">Shot-by-shot 6:00 script</w:t>
+        <w:t xml:space="preserve">Shot-by-shot, 6:00 runtime</w:t>
       </w:r>
     </w:p>
     <w:p>
@@ -24,14 +24,6 @@
       </w:pPr>
       <w:r>
         <w:t xml:space="preserve">Team IICPC HFT Benchmarking Platform</w:t>
-      </w:r>
-    </w:p>
-    <w:p>
-      <w:pPr>
-        <w:pStyle w:val="Date"/>
-      </w:pPr>
-      <w:r>
-        <w:t xml:space="preserve">June 2026</w:t>
       </w:r>
     </w:p>
     <w:sdt>
@@ -60,22 +52,22 @@
         </w:p>
       </w:sdtContent>
     </w:sdt>
-    <w:bookmarkStart w:id="21" w:name="X9a63e21f1eea9de8c6f6d67f9fd0aed9a59d12a"/>
+    <w:bookmarkStart w:id="21" w:name="Xad3c5c150510f0c63ee3e7277238cbc68f916a7"/>
     <w:p>
       <w:pPr>
         <w:pStyle w:val="Heading1"/>
       </w:pPr>
       <w:r>
-        <w:t xml:space="preserve">Demo Video Script — IICPC HFT Benchmarking Platform</w:t>
-      </w:r>
-    </w:p>
-    <w:bookmarkStart w:id="9" w:name="X808f1e63eab6c8b66fd90f2f95a7b9ed92c292a"/>
+        <w:t xml:space="preserve">Demo Video Script: IICPC HFT Benchmarking Platform</w:t>
+      </w:r>
+    </w:p>
+    <w:bookmarkStart w:id="9" w:name="X9434c5dbbf2b68729c3fee022878f3c38c06f7a"/>
     <w:p>
       <w:pPr>
         <w:pStyle w:val="Heading3"/>
       </w:pPr>
       <w:r>
-        <w:t xml:space="preserve">Target runtime: 6:00 (within the 5–7 min window) · One narrator + screen capture</w:t>
+        <w:t xml:space="preserve">Target runtime: 6:00 (within the 5-7 min window) / One narrator + screen capture</w:t>
       </w:r>
     </w:p>
     <w:p>
@@ -115,7 +107,7 @@
           <w:b/>
           <w:bCs/>
         </w:rPr>
-        <w:t xml:space="preserve">Before you hit record — read this:</w:t>
+        <w:t xml:space="preserve">Before you hit record - read this:</w:t>
       </w:r>
     </w:p>
     <w:p>
@@ -171,7 +163,7 @@
         </w:numPr>
       </w:pPr>
       <w:r>
-        <w:t xml:space="preserve">Keep cuts tight. No dead air watching things compile — pre-build, then cut to</w:t>
+        <w:t xml:space="preserve">Keep cuts tight. No dead air watching things compile - pre-build, then cut to</w:t>
       </w:r>
       <w:r>
         <w:t xml:space="preserve"> </w:t>
@@ -401,7 +393,7 @@
         <w:rPr>
           <w:rStyle w:val="CommentTok"/>
         </w:rPr>
-        <w:t xml:space="preserve"># 2) Terminal A — live telemetry feed</w:t>
+        <w:t xml:space="preserve"># 2) Terminal A: live telemetry feed</w:t>
       </w:r>
       <w:r>
         <w:br/>
@@ -485,7 +477,7 @@
         <w:rPr>
           <w:rStyle w:val="CommentTok"/>
         </w:rPr>
-        <w:t xml:space="preserve">#    → ws://localhost:8080/leaderboard/deltas</w:t>
+        <w:t xml:space="preserve"># serves ws://localhost:8080/leaderboard/deltas</w:t>
       </w:r>
       <w:r>
         <w:br/>
@@ -497,7 +489,7 @@
         <w:rPr>
           <w:rStyle w:val="CommentTok"/>
         </w:rPr>
-        <w:t xml:space="preserve"># 3) Terminal B — serve the leaderboard</w:t>
+        <w:t xml:space="preserve"># 3) Terminal B: serve the leaderboard</w:t>
       </w:r>
       <w:r>
         <w:br/>
@@ -548,13 +540,13 @@
         <w:rPr>
           <w:rStyle w:val="NormalTok"/>
         </w:rPr>
-        <w:t xml:space="preserve"> http.server 8088     </w:t>
+        <w:t xml:space="preserve"> http.server 8088    </w:t>
       </w:r>
       <w:r>
         <w:rPr>
           <w:rStyle w:val="CommentTok"/>
         </w:rPr>
-        <w:t xml:space="preserve"># → http://localhost:8088</w:t>
+        <w:t xml:space="preserve"># serves http://localhost:8088</w:t>
       </w:r>
     </w:p>
     <w:p>
@@ -679,7 +671,7 @@
         <w:pStyle w:val="BodyText"/>
       </w:pPr>
       <w:r>
-        <w:t xml:space="preserve">Pre-stage the CO-proof and demo commands in shell history (press ↑, don't type).</w:t>
+        <w:t xml:space="preserve">Pre-stage the CO-proof and demo commands in shell history (press the up-arrow key, don't type live).</w:t>
       </w:r>
     </w:p>
     <w:p>
@@ -699,13 +691,13 @@
         <w:t xml:space="preserve">SHOT LIST &amp; SCRIPT</w:t>
       </w:r>
     </w:p>
-    <w:bookmarkStart w:id="11" w:name="X32bbdcfa5fcf2fb946ca4f87738aa9dee885dcf"/>
+    <w:bookmarkStart w:id="11" w:name="X6fa20ca40efb1aff97c9d06bee68ffb0f262af1"/>
     <w:p>
       <w:pPr>
         <w:pStyle w:val="Heading3"/>
       </w:pPr>
       <w:r>
-        <w:t xml:space="preserve">0:00 – 0:30 — The hook (cold open, no logo)</w:t>
+        <w:t xml:space="preserve">[0:00 - 0:30] The hook (cold open, no logo)</w:t>
       </w:r>
     </w:p>
     <w:p>
@@ -738,7 +730,7 @@
         <w:t xml:space="preserve"> </w:t>
       </w:r>
       <w:r>
-        <w:t xml:space="preserve">showcase, slow scroll into the glowing core →</w:t>
+        <w:t xml:space="preserve">showcase, slow scroll into the glowing core, then</w:t>
       </w:r>
       <w:r>
         <w:t xml:space="preserve"> </w:t>
@@ -764,7 +756,7 @@
         <w:pStyle w:val="BlockText"/>
       </w:pPr>
       <w:r>
-        <w:t xml:space="preserve">"Most latency benchmarks lie. Not on purpose — they have a structural bug</w:t>
+        <w:t xml:space="preserve">"Most latency benchmarks lie. Not on purpose - they have a structural bug</w:t>
       </w:r>
       <w:r>
         <w:t xml:space="preserve"> </w:t>
@@ -851,13 +843,13 @@
       </w:r>
     </w:p>
     <w:bookmarkEnd w:id="11"/>
-    <w:bookmarkStart w:id="12" w:name="X0f6fb05b628b4c0538e989e275bf3ee6bedf9ee"/>
+    <w:bookmarkStart w:id="12" w:name="Xc2b6a25d354fe57d9fae5cc8520d48edebe81ff"/>
     <w:p>
       <w:pPr>
         <w:pStyle w:val="Heading3"/>
       </w:pPr>
       <w:r>
-        <w:t xml:space="preserve">0:30 – 1:30 — The architecture (the 30,000-ft view)</w:t>
+        <w:t xml:space="preserve">[0:30 - 1:30] The architecture (the 30,000-ft view)</w:t>
       </w:r>
     </w:p>
     <w:p>
@@ -984,7 +976,7 @@
         <w:t xml:space="preserve"> </w:t>
       </w:r>
       <w:r>
-        <w:t xml:space="preserve">— not a container. That's deliberate: a container</w:t>
+        <w:t xml:space="preserve">- not a container. That's deliberate: a container</w:t>
       </w:r>
       <w:r>
         <w:t xml:space="preserve"> </w:t>
@@ -1040,7 +1032,7 @@
         <w:t xml:space="preserve"> </w:t>
       </w:r>
       <w:r>
-        <w:t xml:space="preserve">— an open-loop, CPU-pinned C++</w:t>
+        <w:t xml:space="preserve">- an open-loop, CPU-pinned C++</w:t>
       </w:r>
       <w:r>
         <w:t xml:space="preserve"> </w:t>
@@ -1071,7 +1063,7 @@
         <w:t xml:space="preserve">display-only leaderboard</w:t>
       </w:r>
       <w:r>
-        <w:t xml:space="preserve">. It never computes a percentile —</w:t>
+        <w:t xml:space="preserve">. It never computes a percentile -</w:t>
       </w:r>
       <w:r>
         <w:t xml:space="preserve"> </w:t>
@@ -1128,13 +1120,13 @@
       </w:r>
     </w:p>
     <w:bookmarkEnd w:id="12"/>
-    <w:bookmarkStart w:id="13" w:name="X51a23e77c55c0b4559f25c1a25ec2fdbb978e3a"/>
+    <w:bookmarkStart w:id="13" w:name="X1ca6787f2461ec0d370ba6469d5f173f35c0c69"/>
     <w:p>
       <w:pPr>
         <w:pStyle w:val="Heading3"/>
       </w:pPr>
       <w:r>
-        <w:t xml:space="preserve">1:30 – 3:00 — The centrepiece: Coordinated Omission, proven live</w:t>
+        <w:t xml:space="preserve">[1:30 - 3:00] The centerpiece: Coordinated Omission, proven live</w:t>
       </w:r>
     </w:p>
     <w:p>
@@ -1328,7 +1320,7 @@
         <w:t xml:space="preserve"> </w:t>
       </w:r>
       <w:r>
-        <w:t xml:space="preserve">— a planted, known defect.</w:t>
+        <w:t xml:space="preserve">- a planted, known defect.</w:t>
       </w:r>
       <w:r>
         <w:t xml:space="preserve"> </w:t>
@@ -1353,7 +1345,7 @@
         <w:t xml:space="preserve"> </w:t>
       </w:r>
       <w:r>
-        <w:t xml:space="preserve">freezes too — it can't send orders during the stall — so the samples that</w:t>
+        <w:t xml:space="preserve">freezes too - it can't send orders during the stall - so the samples that</w:t>
       </w:r>
       <w:r>
         <w:t xml:space="preserve"> </w:t>
@@ -1406,7 +1398,7 @@
         <w:t xml:space="preserve">latency</w:t>
       </w:r>
       <w:r>
-        <w:t xml:space="preserve">, not as missing data —</w:t>
+        <w:t xml:space="preserve">, not as missing data -</w:t>
       </w:r>
       <w:r>
         <w:t xml:space="preserve"> </w:t>
@@ -1454,7 +1446,7 @@
         <w:t xml:space="preserve"> </w:t>
       </w:r>
       <w:r>
-        <w:t xml:space="preserve">— 'great</w:t>
+        <w:t xml:space="preserve">- 'great</w:t>
       </w:r>
       <w:r>
         <w:t xml:space="preserve"> </w:t>
@@ -1476,7 +1468,7 @@
         <w:t xml:space="preserve"> </w:t>
       </w:r>
       <w:r>
-        <w:t xml:space="preserve">— a</w:t>
+        <w:t xml:space="preserve">- a</w:t>
       </w:r>
       <w:r>
         <w:t xml:space="preserve"> </w:t>
@@ -1506,7 +1498,7 @@
         <w:t xml:space="preserve"> </w:t>
       </w:r>
       <w:r>
-        <w:t xml:space="preserve">The 3.4 ms is the truth — that's exactly the stall I injected.</w:t>
+        <w:t xml:space="preserve">The 3.4 ms is the truth - that's exactly the stall I injected.</w:t>
       </w:r>
       <w:r>
         <w:t xml:space="preserve"> </w:t>
@@ -1539,13 +1531,13 @@
       </w:r>
     </w:p>
     <w:bookmarkEnd w:id="13"/>
-    <w:bookmarkStart w:id="14" w:name="X8cdc0e747b7970de99786ea19ad6b182bc2c97d"/>
+    <w:bookmarkStart w:id="14" w:name="X10bbe3fc152c6191ec4405255d869d5b5b9d136"/>
     <w:p>
       <w:pPr>
         <w:pStyle w:val="Heading3"/>
       </w:pPr>
       <w:r>
-        <w:t xml:space="preserve">3:00 – 3:50 — Correctness: the byte-exact validator</w:t>
+        <w:t xml:space="preserve">[3:00 - 3:50] Correctness: the byte-exact validator</w:t>
       </w:r>
     </w:p>
     <w:p>
@@ -1609,7 +1601,7 @@
         <w:pStyle w:val="BlockText"/>
       </w:pPr>
       <w:r>
-        <w:t xml:space="preserve">"Speed is only half the score — an engine can be fast by</w:t>
+        <w:t xml:space="preserve">"Speed is only half the score - an engine can be fast by</w:t>
       </w:r>
       <w:r>
         <w:t xml:space="preserve"> </w:t>
@@ -1653,7 +1645,7 @@
         <w:t xml:space="preserve"> </w:t>
       </w:r>
       <w:r>
-        <w:t xml:space="preserve">This demo plants a real-world exchange bug: LIFO matching — the</w:t>
+        <w:t xml:space="preserve">This demo plants a real-world exchange bug: LIFO matching - the</w:t>
       </w:r>
       <w:r>
         <w:t xml:space="preserve"> </w:t>
@@ -1675,7 +1667,7 @@
         <w:t xml:space="preserve"> </w:t>
       </w:r>
       <w:r>
-        <w:t xml:space="preserve">fills first instead of the oldest — a price-time-priority violation that real</w:t>
+        <w:t xml:space="preserve">fills first instead of the oldest - a price-time-priority violation that real</w:t>
       </w:r>
       <w:r>
         <w:t xml:space="preserve"> </w:t>
@@ -1716,13 +1708,13 @@
         <w:t xml:space="preserve">divergence at byte 244</w:t>
       </w:r>
       <w:r>
-        <w:t xml:space="preserve">, message #7 — the first</w:t>
-      </w:r>
-      <w:r>
-        <w:t xml:space="preserve"> </w:t>
-      </w:r>
-      <w:r>
-        <w:t xml:space="preserve">aggressive trade — wrong order matched. No heuristics, no thresholds. And on the</w:t>
+        <w:t xml:space="preserve">, message #7 - the first</w:t>
+      </w:r>
+      <w:r>
+        <w:t xml:space="preserve"> </w:t>
+      </w:r>
+      <w:r>
+        <w:t xml:space="preserve">aggressive trade - wrong order matched. No heuristics, no thresholds. And on the</w:t>
       </w:r>
       <w:r>
         <w:t xml:space="preserve"> </w:t>
@@ -1744,7 +1736,7 @@
         <w:t xml:space="preserve"> </w:t>
       </w:r>
       <w:r>
-        <w:t xml:space="preserve">— speed never buys</w:t>
+        <w:t xml:space="preserve">- speed never buys</w:t>
       </w:r>
       <w:r>
         <w:t xml:space="preserve"> </w:t>
@@ -1761,13 +1753,13 @@
       </w:r>
     </w:p>
     <w:bookmarkEnd w:id="14"/>
-    <w:bookmarkStart w:id="15" w:name="X382cfa8ebc92d54ea96688b3373c337030c030d"/>
+    <w:bookmarkStart w:id="15" w:name="X7e3e0f066e2939cf3e8b19ca73d184770139959"/>
     <w:p>
       <w:pPr>
         <w:pStyle w:val="Heading3"/>
       </w:pPr>
       <w:r>
-        <w:t xml:space="preserve">3:50 – 5:00 — The leaderboard (live, and why it's trustworthy)</w:t>
+        <w:t xml:space="preserve">[3:50 - 5:00] The leaderboard (live, and why it's trustworthy)</w:t>
       </w:r>
     </w:p>
     <w:p>
@@ -1785,7 +1777,7 @@
         <w:t xml:space="preserve"> </w:t>
       </w:r>
       <w:r>
-        <w:t xml:space="preserve">the live leaderboard. Click the protocol bar FIX → WS → REST.</w:t>
+        <w:t xml:space="preserve">the live leaderboard. Click the protocol bar FIX to WS to REST.</w:t>
       </w:r>
       <w:r>
         <w:t xml:space="preserve"> </w:t>
@@ -1811,7 +1803,7 @@
         <w:pStyle w:val="BlockText"/>
       </w:pPr>
       <w:r>
-        <w:t xml:space="preserve">"This is the live board — real-time deltas over WebSocket, not a screenshot.</w:t>
+        <w:t xml:space="preserve">"This is the live board - real-time deltas over WebSocket, not a screenshot.</w:t>
       </w:r>
       <w:r>
         <w:t xml:space="preserve"> </w:t>
@@ -1833,7 +1825,7 @@
         <w:t xml:space="preserve"> </w:t>
       </w:r>
       <w:r>
-        <w:t xml:space="preserve">We never mix FIX, WebSocket, and REST —</w:t>
+        <w:t xml:space="preserve">We never mix FIX, WebSocket, and REST -</w:t>
       </w:r>
       <w:r>
         <w:t xml:space="preserve"> </w:t>
@@ -1867,7 +1859,7 @@
         <w:t xml:space="preserve"> </w:t>
       </w:r>
       <w:r>
-        <w:t xml:space="preserve">— p50 through p99.99 to max, in</w:t>
+        <w:t xml:space="preserve">- p50 through p99.99 to max, in</w:t>
       </w:r>
       <w:r>
         <w:t xml:space="preserve"> </w:t>
@@ -1889,7 +1881,7 @@
         <w:t xml:space="preserve"> </w:t>
       </w:r>
       <w:r>
-        <w:t xml:space="preserve">— an average hides the exact stalls</w:t>
+        <w:t xml:space="preserve">- an average hides the exact stalls</w:t>
       </w:r>
       <w:r>
         <w:t xml:space="preserve"> </w:t>
@@ -1901,7 +1893,7 @@
         <w:t xml:space="preserve"> </w:t>
       </w:r>
       <w:r>
-        <w:t xml:space="preserve">Third — this greyed row: it was</w:t>
+        <w:t xml:space="preserve">Third - this greyed row: it was</w:t>
       </w:r>
       <w:r>
         <w:t xml:space="preserve"> </w:t>
@@ -1945,7 +1937,7 @@
         <w:t xml:space="preserve"> </w:t>
       </w:r>
       <w:r>
-        <w:t xml:space="preserve">it was measuring. We'd rather drop a number than show a dishonest one — that's a</w:t>
+        <w:t xml:space="preserve">it was measuring. We'd rather drop a number than show a dishonest one - that's a</w:t>
       </w:r>
       <w:r>
         <w:t xml:space="preserve"> </w:t>
@@ -1976,7 +1968,7 @@
         <w:t xml:space="preserve"> </w:t>
       </w:r>
       <w:r>
-        <w:t xml:space="preserve">of per-bot p99s — because averaging percentiles is mathematically meaningless."</w:t>
+        <w:t xml:space="preserve">of per-bot p99s - because averaging percentiles is mathematically meaningless."</w:t>
       </w:r>
     </w:p>
     <w:p>
@@ -2008,7 +2000,7 @@
         <w:pStyle w:val="BlockText"/>
       </w:pPr>
       <w:r>
-        <w:t xml:space="preserve">"And it's mock-first: if the live feed drops, the board falls back instantly —</w:t>
+        <w:t xml:space="preserve">"And it's mock-first: if the live feed drops, the board falls back instantly -</w:t>
       </w:r>
       <w:r>
         <w:t xml:space="preserve"> </w:t>
@@ -2025,13 +2017,13 @@
       </w:r>
     </w:p>
     <w:bookmarkEnd w:id="15"/>
-    <w:bookmarkStart w:id="16" w:name="X80f0ebb2bdb06b48b19a7650fbfd669b2d9d723"/>
+    <w:bookmarkStart w:id="16" w:name="X7553d4033bf3573ecce4e62f3c040d93ba978e8"/>
     <w:p>
       <w:pPr>
         <w:pStyle w:val="Heading3"/>
       </w:pPr>
       <w:r>
-        <w:t xml:space="preserve">5:00 – 5:40 — Proof it's deploy-ready &amp; verified</w:t>
+        <w:t xml:space="preserve">[5:00 - 5:40] Proof it's deploy-ready and verified</w:t>
       </w:r>
     </w:p>
     <w:p>
@@ -2049,7 +2041,7 @@
         <w:t xml:space="preserve"> </w:t>
       </w:r>
       <w:r>
-        <w:t xml:space="preserve">split or quick cuts —</w:t>
+        <w:t xml:space="preserve">split or quick cuts -</w:t>
       </w:r>
       <w:r>
         <w:t xml:space="preserve"> </w:t>
@@ -2138,7 +2130,7 @@
         <w:t xml:space="preserve"> </w:t>
       </w:r>
       <w:r>
-        <w:t xml:space="preserve">— the hot path allocates nothing after startup, and</w:t>
+        <w:t xml:space="preserve">- the hot path allocates nothing after startup, and</w:t>
       </w:r>
       <w:r>
         <w:t xml:space="preserve"> </w:t>
@@ -2160,13 +2152,13 @@
         <w:t xml:space="preserve"> </w:t>
       </w:r>
       <w:r>
-        <w:t xml:space="preserve">— 8× over-</w:t>
-      </w:r>
-      <w:r>
-        <w:t xml:space="preserve"> </w:t>
-      </w:r>
-      <w:r>
-        <w:t xml:space="preserve">subscription — with every single order accounted for, zero collisions. The</w:t>
+        <w:t xml:space="preserve">- 8x over-</w:t>
+      </w:r>
+      <w:r>
+        <w:t xml:space="preserve"> </w:t>
+      </w:r>
+      <w:r>
+        <w:t xml:space="preserve">subscription - with every single order accounted for, zero collisions. The</w:t>
       </w:r>
       <w:r>
         <w:t xml:space="preserve"> </w:t>
@@ -2216,7 +2208,7 @@
         <w:t xml:space="preserve"> </w:t>
       </w:r>
       <w:r>
-        <w:t xml:space="preserve">and the real one — a bare-metal Kubernetes</w:t>
+        <w:t xml:space="preserve">and the real one - a bare-metal Kubernetes</w:t>
       </w:r>
       <w:r>
         <w:t xml:space="preserve"> </w:t>
@@ -2288,13 +2280,13 @@
       </w:r>
     </w:p>
     <w:bookmarkEnd w:id="16"/>
-    <w:bookmarkStart w:id="17" w:name="Xd9bdf9ab84d1ce5be456bc21955037a497f7c93"/>
+    <w:bookmarkStart w:id="17" w:name="X033371a2d9551150a50c4da372cd212a4ca486d"/>
     <w:p>
       <w:pPr>
         <w:pStyle w:val="Heading3"/>
       </w:pPr>
       <w:r>
-        <w:t xml:space="preserve">5:40 – 6:00 — The close</w:t>
+        <w:t xml:space="preserve">[5:40 - 6:00] The close</w:t>
       </w:r>
     </w:p>
     <w:p>
@@ -2354,7 +2346,7 @@
         <w:t xml:space="preserve"> </w:t>
       </w:r>
       <w:r>
-        <w:t xml:space="preserve">skipped AVX-512, AF_XDP, and Aeron — and we can tell you the exact throughput at</w:t>
+        <w:t xml:space="preserve">skipped AVX-512, AF_XDP, and Aeron - and we can tell you the exact throughput at</w:t>
       </w:r>
       <w:r>
         <w:t xml:space="preserve"> </w:t>
@@ -2479,7 +2471,7 @@
               <w:pStyle w:val="Compact"/>
             </w:pPr>
             <w:r>
-              <w:t xml:space="preserve">Leaderboard auto-falls-back to mock — visually identical; keep going</w:t>
+              <w:t xml:space="preserve">Leaderboard auto-falls-back to mock - visually identical; keep going</w:t>
             </w:r>
           </w:p>
         </w:tc>
@@ -2542,7 +2534,7 @@
               <w:pStyle w:val="Compact"/>
             </w:pPr>
             <w:r>
-              <w:t xml:space="preserve">Say it up front: "CPU pinning is a no-op here, so you'll see scheduler jitter — on the bare-metal K8s path that disappears." Honesty = competence</w:t>
+              <w:t xml:space="preserve">Say it up front: "CPU pinning is a no-op here, so you'll see scheduler jitter - on the bare-metal K8s path that disappears." Honesty = competence</w:t>
             </w:r>
           </w:p>
         </w:tc>
@@ -2709,7 +2701,7 @@
               <w:pStyle w:val="Compact"/>
             </w:pPr>
             <w:r>
-              <w:t xml:space="preserve">CO proof (centrepiece)</w:t>
+              <w:t xml:space="preserve">CO proof (centerpiece)</w:t>
             </w:r>
           </w:p>
         </w:tc>
@@ -3666,19 +3658,32 @@
     <w:qFormat/>
     <w:tblPr>
       <w:tblInd w:type="dxa" w:w="0"/>
+      <w:tblBorders>
+        <w:top w:color="D0D7DE" w:space="0" w:sz="4" w:val="single"/>
+        <w:left w:color="D0D7DE" w:space="0" w:sz="4" w:val="single"/>
+        <w:bottom w:color="D0D7DE" w:space="0" w:sz="4" w:val="single"/>
+        <w:right w:color="D0D7DE" w:space="0" w:sz="4" w:val="single"/>
+        <w:insideH w:color="E6E9EC" w:space="0" w:sz="4" w:val="single"/>
+        <w:insideV w:color="E6E9EC" w:space="0" w:sz="4" w:val="single"/>
+      </w:tblBorders>
       <w:tblCellMar>
-        <w:top w:type="dxa" w:w="0"/>
-        <w:left w:type="dxa" w:w="108"/>
-        <w:bottom w:type="dxa" w:w="0"/>
-        <w:right w:type="dxa" w:w="108"/>
+        <w:top w:type="dxa" w:w="70"/>
+        <w:left w:type="dxa" w:w="120"/>
+        <w:bottom w:type="dxa" w:w="70"/>
+        <w:right w:type="dxa" w:w="120"/>
       </w:tblCellMar>
     </w:tblPr>
     <w:tblStylePr w:type="firstRow">
+      <w:rPr>
+        <w:b/>
+        <w:color w:val="0C3A5E"/>
+      </w:rPr>
       <w:tcPr>
         <w:tcBorders>
-          <w:bottom w:val="single"/>
+          <w:bottom w:color="9DB7CC" w:space="0" w:sz="8" w:val="single"/>
         </w:tcBorders>
-        <w:vAlign w:val="bottom"/>
+        <w:shd w:color="auto" w:fill="EAF1F7" w:val="clear"/>
+        <w:vAlign w:val="center"/>
       </w:tcPr>
     </w:tblStylePr>
   </w:style>

</xml_diff>